<commit_message>
docs: refactor TB1 report and dataset to generalized N x N Sudoku (2401 nodes)
</commit_message>
<xml_diff>
--- a/report/TB1_1ACC0184_2026-20_u202412921_Kobashigawa_u202411627_Pareja_u20241c998_Riveros.docx
+++ b/report/TB1_1ACC0184_2026-20_u202412921_Kobashigawa_u202411627_Pareja_u20241c998_Riveros.docx
@@ -1725,9 +1725,6 @@
     <w:p>
       <w:pPr>
         <w:jc w:val="both"/>
-        <w:rPr>
-          <w:rFonts w:ascii="Times New Roman" w:eastAsia="Times New Roman" w:hAnsi="Times New Roman" w:cs="Times New Roman"/>
-        </w:rPr>
       </w:pPr>
       <w:r>
         <w:rPr>
@@ -1758,6 +1755,86 @@
     </w:p>
     <w:p>
       <w:pPr>
+        <w:jc w:val="both"/>
+        <w:rPr>
+          <w:rFonts w:ascii="Times New Roman" w:eastAsia="Times New Roman" w:hAnsi="Times New Roman" w:cs="Times New Roman"/>
+        </w:rPr>
+      </w:pPr>
+      <w:r>
+        <w:rPr>
+          <w:rFonts w:ascii="Times New Roman" w:eastAsia="Times New Roman" w:hAnsi="Times New Roman" w:cs="Times New Roman"/>
+        </w:rPr>
+        <w:t>En respuesta a esta problemática, el objetivo principal de este proyecto es diseñar e implementar un motor computacional basado en Teoría de Grafos capaz de validar y resolver tableros de Sudoku mitigando su extrema complejidad temporal. Para alcanzar esto, se plantean los siguientes objetivos específicos:</w:t>
+      </w:r>
+    </w:p>
+    <w:p>
+      <w:pPr>
+        <w:pStyle w:val="ListParagraph"/>
+        <w:numPr>
+          <w:ilvl w:val="0"/>
+          <w:numId w:val="23"/>
+        </w:numPr>
+        <w:jc w:val="both"/>
+        <w:rPr>
+          <w:rFonts w:ascii="Times New Roman" w:eastAsia="Times New Roman" w:hAnsi="Times New Roman" w:cs="Times New Roman"/>
+        </w:rPr>
+      </w:pPr>
+      <w:r>
+        <w:rPr>
+          <w:rFonts w:ascii="Times New Roman" w:eastAsia="Times New Roman" w:hAnsi="Times New Roman" w:cs="Times New Roman"/>
+        </w:rPr>
+        <w:t xml:space="preserve">Modelar matemáticamente las reglas del juego mediante un </w:t>
+      </w:r>
+      <w:proofErr w:type="spellStart"/>
+      <w:r>
+        <w:rPr>
+          <w:rFonts w:ascii="Times New Roman" w:eastAsia="Times New Roman" w:hAnsi="Times New Roman" w:cs="Times New Roman"/>
+        </w:rPr>
+        <w:t>dataset</w:t>
+      </w:r>
+      <w:proofErr w:type="spellEnd"/>
+      <w:r>
+        <w:rPr>
+          <w:rFonts w:ascii="Times New Roman" w:eastAsia="Times New Roman" w:hAnsi="Times New Roman" w:cs="Times New Roman"/>
+        </w:rPr>
+        <w:t xml:space="preserve"> geométrico que supere los 1500 nodos (simulando una arquitectura de múltiples partidas concurrentes).</w:t>
+      </w:r>
+    </w:p>
+    <w:p>
+      <w:pPr>
+        <w:pStyle w:val="ListParagraph"/>
+        <w:numPr>
+          <w:ilvl w:val="0"/>
+          <w:numId w:val="23"/>
+        </w:numPr>
+        <w:jc w:val="both"/>
+        <w:rPr>
+          <w:rFonts w:ascii="Times New Roman" w:eastAsia="Times New Roman" w:hAnsi="Times New Roman" w:cs="Times New Roman"/>
+        </w:rPr>
+      </w:pPr>
+      <w:r>
+        <w:rPr>
+          <w:rFonts w:ascii="Times New Roman" w:eastAsia="Times New Roman" w:hAnsi="Times New Roman" w:cs="Times New Roman"/>
+        </w:rPr>
+        <w:t>Establecer la base estructural para aplicar algoritmos de búsqueda con retroceso (</w:t>
+      </w:r>
+      <w:proofErr w:type="spellStart"/>
+      <w:r>
+        <w:rPr>
+          <w:rFonts w:ascii="Times New Roman" w:eastAsia="Times New Roman" w:hAnsi="Times New Roman" w:cs="Times New Roman"/>
+        </w:rPr>
+        <w:t>Backtracking</w:t>
+      </w:r>
+      <w:proofErr w:type="spellEnd"/>
+      <w:r>
+        <w:rPr>
+          <w:rFonts w:ascii="Times New Roman" w:eastAsia="Times New Roman" w:hAnsi="Times New Roman" w:cs="Times New Roman"/>
+        </w:rPr>
+        <w:t>) que garanticen una solución óptima en fracciones de segundo.</w:t>
+      </w:r>
+    </w:p>
+    <w:p>
+      <w:pPr>
         <w:pStyle w:val="Heading3"/>
         <w:numPr>
           <w:ilvl w:val="0"/>
@@ -1889,7 +1966,15 @@
           <w:rFonts w:ascii="Times New Roman" w:hAnsi="Times New Roman" w:cs="Times New Roman"/>
           <w:lang w:val="es-PE"/>
         </w:rPr>
-        <w:t xml:space="preserve"> de 3x3) y traducirlas a un modelo de relaciones topológicas puramente matemáticas. Al deshacernos del concepto visual del tablero y convertirlo en un mapa de restricciones algorítmicas, podemos aplicar búsquedas profundas que evitan calcular movimientos ilegales.</w:t>
+        <w:t xml:space="preserve"> de 3x3) y traducirlas a un modelo de relaciones topológicas puramente matemáticas. Al deshacernos del concepto visual del </w:t>
+      </w:r>
+      <w:r>
+        <w:rPr>
+          <w:rFonts w:ascii="Times New Roman" w:hAnsi="Times New Roman" w:cs="Times New Roman"/>
+          <w:lang w:val="es-PE"/>
+        </w:rPr>
+        <w:lastRenderedPageBreak/>
+        <w:t>tablero y convertirlo en un mapa de restricciones algorítmicas, podemos aplicar búsquedas profundas que evitan calcular movimientos ilegales.</w:t>
       </w:r>
     </w:p>
     <w:p>
@@ -1999,15 +2084,7 @@
           <w:rFonts w:ascii="Times New Roman" w:hAnsi="Times New Roman" w:cs="Times New Roman"/>
           <w:lang w:val="es-PE"/>
         </w:rPr>
-        <w:t xml:space="preserve"> correspondientes a las celdas de las 20 instancias simultáneas (81 nodos por partida). Esto cumple de manera </w:t>
-      </w:r>
-      <w:r>
-        <w:rPr>
-          <w:rFonts w:ascii="Times New Roman" w:hAnsi="Times New Roman" w:cs="Times New Roman"/>
-          <w:lang w:val="es-PE"/>
-        </w:rPr>
-        <w:lastRenderedPageBreak/>
-        <w:t>irrefutable con el requisito del curso de superar los 1500 nodos. Cada registro almacena su identificación única y su coordenada matricial.</w:t>
+        <w:t xml:space="preserve"> correspondientes a las celdas de las 20 instancias simultáneas (81 nodos por partida). Esto cumple de manera irrefutable con el requisito del curso de superar los 1500 nodos. Cada registro almacena su identificación única y su coordenada matricial.</w:t>
       </w:r>
     </w:p>
     <w:p>
@@ -2196,6 +2273,7 @@
       <w:r>
         <w:rPr>
           <w:rFonts w:ascii="Times New Roman" w:hAnsi="Times New Roman" w:cs="Times New Roman"/>
+          <w:noProof/>
           <w:lang w:val="es-PE"/>
         </w:rPr>
         <w:lastRenderedPageBreak/>
@@ -2371,23 +2449,7 @@
           <w:b/>
           <w:lang w:val="es-PE"/>
         </w:rPr>
-        <w:t xml:space="preserve"> (Vuelta</w:t>
-      </w:r>
-      <w:r>
-        <w:rPr>
-          <w:rFonts w:ascii="Times New Roman" w:eastAsia="Segoe UI" w:hAnsi="Times New Roman" w:cs="Times New Roman"/>
-          <w:b/>
-          <w:lang w:val="es-PE"/>
-        </w:rPr>
-        <w:t xml:space="preserve"> </w:t>
-      </w:r>
-      <w:r>
-        <w:rPr>
-          <w:rFonts w:ascii="Times New Roman" w:eastAsia="Segoe UI" w:hAnsi="Times New Roman" w:cs="Times New Roman"/>
-          <w:b/>
-          <w:lang w:val="es-PE"/>
-        </w:rPr>
-        <w:t>Atrás)</w:t>
+        <w:t xml:space="preserve"> (Vuelta Atrás)</w:t>
       </w:r>
       <w:r>
         <w:rPr>
@@ -3051,6 +3113,119 @@
 <file path=word/numbering.xml><?xml version="1.0" encoding="utf-8"?>
 <w:numbering xmlns:wpc="http://schemas.microsoft.com/office/word/2010/wordprocessingCanvas" xmlns:cx="http://schemas.microsoft.com/office/drawing/2014/chartex" xmlns:cx1="http://schemas.microsoft.com/office/drawing/2015/9/8/chartex" xmlns:cx2="http://schemas.microsoft.com/office/drawing/2015/10/21/chartex" xmlns:cx3="http://schemas.microsoft.com/office/drawing/2016/5/9/chartex" xmlns:cx4="http://schemas.microsoft.com/office/drawing/2016/5/10/chartex" xmlns:cx5="http://schemas.microsoft.com/office/drawing/2016/5/11/chartex" xmlns:cx6="http://schemas.microsoft.com/office/drawing/2016/5/12/chartex" xmlns:cx7="http://schemas.microsoft.com/office/drawing/2016/5/13/chartex" xmlns:cx8="http://schemas.microsoft.com/office/drawing/2016/5/14/chartex" xmlns:mc="http://schemas.openxmlformats.org/markup-compatibility/2006" xmlns:aink="http://schemas.microsoft.com/office/drawing/2016/ink" xmlns:am3d="http://schemas.microsoft.com/office/drawing/2017/model3d" xmlns:o="urn:schemas-microsoft-com:office:office" xmlns:oel="http://schemas.microsoft.com/office/2019/extlst" xmlns:r="http://schemas.openxmlformats.org/officeDocument/2006/relationships" xmlns:m="http://schemas.openxmlformats.org/officeDocument/2006/math" xmlns:v="urn:schemas-microsoft-com:vml" xmlns:wp14="http://schemas.microsoft.com/office/word/2010/wordprocessingDrawing" xmlns:wp="http://schemas.openxmlformats.org/drawingml/2006/wordprocessingDrawing" xmlns:w10="urn:schemas-microsoft-com:office:word" xmlns:w="http://schemas.openxmlformats.org/wordprocessingml/2006/main" xmlns:w14="http://schemas.microsoft.com/office/word/2010/wordml" xmlns:w15="http://schemas.microsoft.com/office/word/2012/wordml" xmlns:w16cex="http://schemas.microsoft.com/office/word/2018/wordml/cex" xmlns:w16cid="http://schemas.microsoft.com/office/word/2016/wordml/cid" xmlns:w16="http://schemas.microsoft.com/office/word/2018/wordml" xmlns:w16du="http://schemas.microsoft.com/office/word/2023/wordml/word16du" xmlns:w16sdtdh="http://schemas.microsoft.com/office/word/2020/wordml/sdtdatahash" xmlns:w16sdtfl="http://schemas.microsoft.com/office/word/2024/wordml/sdtformatlock" xmlns:w16se="http://schemas.microsoft.com/office/word/2015/wordml/symex" xmlns:wpg="http://schemas.microsoft.com/office/word/2010/wordprocessingGroup" xmlns:wpi="http://schemas.microsoft.com/office/word/2010/wordprocessingInk" xmlns:wne="http://schemas.microsoft.com/office/word/2006/wordml" xmlns:wps="http://schemas.microsoft.com/office/word/2010/wordprocessingShape" mc:Ignorable="w14 w15 w16se w16cid w16 w16cex w16sdtdh w16sdtfl w16du wp14">
   <w:abstractNum w:abstractNumId="0" w15:restartNumberingAfterBreak="0">
+    <w:nsid w:val="02C8730D"/>
+    <w:multiLevelType w:val="hybridMultilevel"/>
+    <w:tmpl w:val="F5E60EF0"/>
+    <w:lvl w:ilvl="0" w:tplc="04090001">
+      <w:start w:val="1"/>
+      <w:numFmt w:val="bullet"/>
+      <w:lvlText w:val=""/>
+      <w:lvlJc w:val="left"/>
+      <w:pPr>
+        <w:ind w:left="720" w:hanging="360"/>
+      </w:pPr>
+      <w:rPr>
+        <w:rFonts w:ascii="Symbol" w:hAnsi="Symbol" w:hint="default"/>
+      </w:rPr>
+    </w:lvl>
+    <w:lvl w:ilvl="1" w:tplc="04090003" w:tentative="1">
+      <w:start w:val="1"/>
+      <w:numFmt w:val="bullet"/>
+      <w:lvlText w:val="o"/>
+      <w:lvlJc w:val="left"/>
+      <w:pPr>
+        <w:ind w:left="1440" w:hanging="360"/>
+      </w:pPr>
+      <w:rPr>
+        <w:rFonts w:ascii="Courier New" w:hAnsi="Courier New" w:cs="Courier New" w:hint="default"/>
+      </w:rPr>
+    </w:lvl>
+    <w:lvl w:ilvl="2" w:tplc="04090005" w:tentative="1">
+      <w:start w:val="1"/>
+      <w:numFmt w:val="bullet"/>
+      <w:lvlText w:val=""/>
+      <w:lvlJc w:val="left"/>
+      <w:pPr>
+        <w:ind w:left="2160" w:hanging="360"/>
+      </w:pPr>
+      <w:rPr>
+        <w:rFonts w:ascii="Wingdings" w:hAnsi="Wingdings" w:hint="default"/>
+      </w:rPr>
+    </w:lvl>
+    <w:lvl w:ilvl="3" w:tplc="04090001" w:tentative="1">
+      <w:start w:val="1"/>
+      <w:numFmt w:val="bullet"/>
+      <w:lvlText w:val=""/>
+      <w:lvlJc w:val="left"/>
+      <w:pPr>
+        <w:ind w:left="2880" w:hanging="360"/>
+      </w:pPr>
+      <w:rPr>
+        <w:rFonts w:ascii="Symbol" w:hAnsi="Symbol" w:hint="default"/>
+      </w:rPr>
+    </w:lvl>
+    <w:lvl w:ilvl="4" w:tplc="04090003" w:tentative="1">
+      <w:start w:val="1"/>
+      <w:numFmt w:val="bullet"/>
+      <w:lvlText w:val="o"/>
+      <w:lvlJc w:val="left"/>
+      <w:pPr>
+        <w:ind w:left="3600" w:hanging="360"/>
+      </w:pPr>
+      <w:rPr>
+        <w:rFonts w:ascii="Courier New" w:hAnsi="Courier New" w:cs="Courier New" w:hint="default"/>
+      </w:rPr>
+    </w:lvl>
+    <w:lvl w:ilvl="5" w:tplc="04090005" w:tentative="1">
+      <w:start w:val="1"/>
+      <w:numFmt w:val="bullet"/>
+      <w:lvlText w:val=""/>
+      <w:lvlJc w:val="left"/>
+      <w:pPr>
+        <w:ind w:left="4320" w:hanging="360"/>
+      </w:pPr>
+      <w:rPr>
+        <w:rFonts w:ascii="Wingdings" w:hAnsi="Wingdings" w:hint="default"/>
+      </w:rPr>
+    </w:lvl>
+    <w:lvl w:ilvl="6" w:tplc="04090001" w:tentative="1">
+      <w:start w:val="1"/>
+      <w:numFmt w:val="bullet"/>
+      <w:lvlText w:val=""/>
+      <w:lvlJc w:val="left"/>
+      <w:pPr>
+        <w:ind w:left="5040" w:hanging="360"/>
+      </w:pPr>
+      <w:rPr>
+        <w:rFonts w:ascii="Symbol" w:hAnsi="Symbol" w:hint="default"/>
+      </w:rPr>
+    </w:lvl>
+    <w:lvl w:ilvl="7" w:tplc="04090003" w:tentative="1">
+      <w:start w:val="1"/>
+      <w:numFmt w:val="bullet"/>
+      <w:lvlText w:val="o"/>
+      <w:lvlJc w:val="left"/>
+      <w:pPr>
+        <w:ind w:left="5760" w:hanging="360"/>
+      </w:pPr>
+      <w:rPr>
+        <w:rFonts w:ascii="Courier New" w:hAnsi="Courier New" w:cs="Courier New" w:hint="default"/>
+      </w:rPr>
+    </w:lvl>
+    <w:lvl w:ilvl="8" w:tplc="04090005" w:tentative="1">
+      <w:start w:val="1"/>
+      <w:numFmt w:val="bullet"/>
+      <w:lvlText w:val=""/>
+      <w:lvlJc w:val="left"/>
+      <w:pPr>
+        <w:ind w:left="6480" w:hanging="360"/>
+      </w:pPr>
+      <w:rPr>
+        <w:rFonts w:ascii="Wingdings" w:hAnsi="Wingdings" w:hint="default"/>
+      </w:rPr>
+    </w:lvl>
+  </w:abstractNum>
+  <w:abstractNum w:abstractNumId="1" w15:restartNumberingAfterBreak="0">
     <w:nsid w:val="0737005F"/>
     <w:multiLevelType w:val="multilevel"/>
     <w:tmpl w:val="B1E886FE"/>
@@ -3163,7 +3338,7 @@
       </w:rPr>
     </w:lvl>
   </w:abstractNum>
-  <w:abstractNum w:abstractNumId="1" w15:restartNumberingAfterBreak="0">
+  <w:abstractNum w:abstractNumId="2" w15:restartNumberingAfterBreak="0">
     <w:nsid w:val="0C140700"/>
     <w:multiLevelType w:val="multilevel"/>
     <w:tmpl w:val="8878FBCC"/>
@@ -3276,7 +3451,7 @@
       </w:rPr>
     </w:lvl>
   </w:abstractNum>
-  <w:abstractNum w:abstractNumId="2" w15:restartNumberingAfterBreak="0">
+  <w:abstractNum w:abstractNumId="3" w15:restartNumberingAfterBreak="0">
     <w:nsid w:val="17541F9A"/>
     <w:multiLevelType w:val="multilevel"/>
     <w:tmpl w:val="0EF2BCDA"/>
@@ -3394,7 +3569,7 @@
       </w:rPr>
     </w:lvl>
   </w:abstractNum>
-  <w:abstractNum w:abstractNumId="3" w15:restartNumberingAfterBreak="0">
+  <w:abstractNum w:abstractNumId="4" w15:restartNumberingAfterBreak="0">
     <w:nsid w:val="18702E26"/>
     <w:multiLevelType w:val="hybridMultilevel"/>
     <w:tmpl w:val="393AD2DE"/>
@@ -3507,7 +3682,7 @@
       </w:rPr>
     </w:lvl>
   </w:abstractNum>
-  <w:abstractNum w:abstractNumId="4" w15:restartNumberingAfterBreak="0">
+  <w:abstractNum w:abstractNumId="5" w15:restartNumberingAfterBreak="0">
     <w:nsid w:val="28476240"/>
     <w:multiLevelType w:val="hybridMultilevel"/>
     <w:tmpl w:val="DDEE90C0"/>
@@ -3719,7 +3894,7 @@
       </w:rPr>
     </w:lvl>
   </w:abstractNum>
-  <w:abstractNum w:abstractNumId="5" w15:restartNumberingAfterBreak="0">
+  <w:abstractNum w:abstractNumId="6" w15:restartNumberingAfterBreak="0">
     <w:nsid w:val="2B325301"/>
     <w:multiLevelType w:val="multilevel"/>
     <w:tmpl w:val="2A9299D2"/>
@@ -3832,7 +4007,7 @@
       </w:rPr>
     </w:lvl>
   </w:abstractNum>
-  <w:abstractNum w:abstractNumId="6" w15:restartNumberingAfterBreak="0">
+  <w:abstractNum w:abstractNumId="7" w15:restartNumberingAfterBreak="0">
     <w:nsid w:val="2B714112"/>
     <w:multiLevelType w:val="multilevel"/>
     <w:tmpl w:val="0B46D42E"/>
@@ -3945,7 +4120,7 @@
       </w:rPr>
     </w:lvl>
   </w:abstractNum>
-  <w:abstractNum w:abstractNumId="7" w15:restartNumberingAfterBreak="0">
+  <w:abstractNum w:abstractNumId="8" w15:restartNumberingAfterBreak="0">
     <w:nsid w:val="333D56BF"/>
     <w:multiLevelType w:val="hybridMultilevel"/>
     <w:tmpl w:val="378C8304"/>
@@ -4058,7 +4233,7 @@
       </w:rPr>
     </w:lvl>
   </w:abstractNum>
-  <w:abstractNum w:abstractNumId="8" w15:restartNumberingAfterBreak="0">
+  <w:abstractNum w:abstractNumId="9" w15:restartNumberingAfterBreak="0">
     <w:nsid w:val="338119F1"/>
     <w:multiLevelType w:val="multilevel"/>
     <w:tmpl w:val="C0E23EDA"/>
@@ -4171,7 +4346,7 @@
       </w:rPr>
     </w:lvl>
   </w:abstractNum>
-  <w:abstractNum w:abstractNumId="9" w15:restartNumberingAfterBreak="0">
+  <w:abstractNum w:abstractNumId="10" w15:restartNumberingAfterBreak="0">
     <w:nsid w:val="36853F3A"/>
     <w:multiLevelType w:val="multilevel"/>
     <w:tmpl w:val="BC86F5B6"/>
@@ -4284,7 +4459,7 @@
       </w:rPr>
     </w:lvl>
   </w:abstractNum>
-  <w:abstractNum w:abstractNumId="10" w15:restartNumberingAfterBreak="0">
+  <w:abstractNum w:abstractNumId="11" w15:restartNumberingAfterBreak="0">
     <w:nsid w:val="39025084"/>
     <w:multiLevelType w:val="multilevel"/>
     <w:tmpl w:val="329AC708"/>
@@ -4401,7 +4576,7 @@
       </w:rPr>
     </w:lvl>
   </w:abstractNum>
-  <w:abstractNum w:abstractNumId="11" w15:restartNumberingAfterBreak="0">
+  <w:abstractNum w:abstractNumId="12" w15:restartNumberingAfterBreak="0">
     <w:nsid w:val="3AD11937"/>
     <w:multiLevelType w:val="multilevel"/>
     <w:tmpl w:val="FA88B96E"/>
@@ -4514,7 +4689,7 @@
       </w:rPr>
     </w:lvl>
   </w:abstractNum>
-  <w:abstractNum w:abstractNumId="12" w15:restartNumberingAfterBreak="0">
+  <w:abstractNum w:abstractNumId="13" w15:restartNumberingAfterBreak="0">
     <w:nsid w:val="3C8E51C9"/>
     <w:multiLevelType w:val="multilevel"/>
     <w:tmpl w:val="CBDC4D6A"/>
@@ -4635,7 +4810,7 @@
       </w:rPr>
     </w:lvl>
   </w:abstractNum>
-  <w:abstractNum w:abstractNumId="13" w15:restartNumberingAfterBreak="0">
+  <w:abstractNum w:abstractNumId="14" w15:restartNumberingAfterBreak="0">
     <w:nsid w:val="4E820969"/>
     <w:multiLevelType w:val="multilevel"/>
     <w:tmpl w:val="423A1E0C"/>
@@ -4748,7 +4923,7 @@
       </w:rPr>
     </w:lvl>
   </w:abstractNum>
-  <w:abstractNum w:abstractNumId="14" w15:restartNumberingAfterBreak="0">
+  <w:abstractNum w:abstractNumId="15" w15:restartNumberingAfterBreak="0">
     <w:nsid w:val="53C751E3"/>
     <w:multiLevelType w:val="multilevel"/>
     <w:tmpl w:val="8B04C10C"/>
@@ -4861,7 +5036,7 @@
       </w:rPr>
     </w:lvl>
   </w:abstractNum>
-  <w:abstractNum w:abstractNumId="15" w15:restartNumberingAfterBreak="0">
+  <w:abstractNum w:abstractNumId="16" w15:restartNumberingAfterBreak="0">
     <w:nsid w:val="5716413B"/>
     <w:multiLevelType w:val="hybridMultilevel"/>
     <w:tmpl w:val="49084B52"/>
@@ -4974,7 +5149,7 @@
       </w:rPr>
     </w:lvl>
   </w:abstractNum>
-  <w:abstractNum w:abstractNumId="16" w15:restartNumberingAfterBreak="0">
+  <w:abstractNum w:abstractNumId="17" w15:restartNumberingAfterBreak="0">
     <w:nsid w:val="581445F9"/>
     <w:multiLevelType w:val="hybridMultilevel"/>
     <w:tmpl w:val="6F3CE80A"/>
@@ -5186,7 +5361,7 @@
       </w:rPr>
     </w:lvl>
   </w:abstractNum>
-  <w:abstractNum w:abstractNumId="17" w15:restartNumberingAfterBreak="0">
+  <w:abstractNum w:abstractNumId="18" w15:restartNumberingAfterBreak="0">
     <w:nsid w:val="5A7A4124"/>
     <w:multiLevelType w:val="hybridMultilevel"/>
     <w:tmpl w:val="7D2473DA"/>
@@ -5299,7 +5474,7 @@
       </w:rPr>
     </w:lvl>
   </w:abstractNum>
-  <w:abstractNum w:abstractNumId="18" w15:restartNumberingAfterBreak="0">
+  <w:abstractNum w:abstractNumId="19" w15:restartNumberingAfterBreak="0">
     <w:nsid w:val="630201A8"/>
     <w:multiLevelType w:val="multilevel"/>
     <w:tmpl w:val="84EE2190"/>
@@ -5412,7 +5587,7 @@
       </w:rPr>
     </w:lvl>
   </w:abstractNum>
-  <w:abstractNum w:abstractNumId="19" w15:restartNumberingAfterBreak="0">
+  <w:abstractNum w:abstractNumId="20" w15:restartNumberingAfterBreak="0">
     <w:nsid w:val="68A30390"/>
     <w:multiLevelType w:val="hybridMultilevel"/>
     <w:tmpl w:val="5106AE9A"/>
@@ -5501,7 +5676,7 @@
       </w:pPr>
     </w:lvl>
   </w:abstractNum>
-  <w:abstractNum w:abstractNumId="20" w15:restartNumberingAfterBreak="0">
+  <w:abstractNum w:abstractNumId="21" w15:restartNumberingAfterBreak="0">
     <w:nsid w:val="6EC972BA"/>
     <w:multiLevelType w:val="multilevel"/>
     <w:tmpl w:val="43242AB6"/>
@@ -5614,7 +5789,7 @@
       </w:rPr>
     </w:lvl>
   </w:abstractNum>
-  <w:abstractNum w:abstractNumId="21" w15:restartNumberingAfterBreak="0">
+  <w:abstractNum w:abstractNumId="22" w15:restartNumberingAfterBreak="0">
     <w:nsid w:val="70EF4BC9"/>
     <w:multiLevelType w:val="hybridMultilevel"/>
     <w:tmpl w:val="68A620BE"/>
@@ -5728,70 +5903,73 @@
     </w:lvl>
   </w:abstractNum>
   <w:num w:numId="1" w16cid:durableId="1798599199">
+    <w:abstractNumId w:val="9"/>
+  </w:num>
+  <w:num w:numId="2" w16cid:durableId="222301535">
+    <w:abstractNumId w:val="14"/>
+  </w:num>
+  <w:num w:numId="3" w16cid:durableId="1746368024">
+    <w:abstractNumId w:val="10"/>
+  </w:num>
+  <w:num w:numId="4" w16cid:durableId="53234700">
+    <w:abstractNumId w:val="12"/>
+  </w:num>
+  <w:num w:numId="5" w16cid:durableId="1110395120">
+    <w:abstractNumId w:val="2"/>
+  </w:num>
+  <w:num w:numId="6" w16cid:durableId="2086339162">
+    <w:abstractNumId w:val="15"/>
+  </w:num>
+  <w:num w:numId="7" w16cid:durableId="1847086496">
+    <w:abstractNumId w:val="7"/>
+  </w:num>
+  <w:num w:numId="8" w16cid:durableId="20325769">
+    <w:abstractNumId w:val="11"/>
+  </w:num>
+  <w:num w:numId="9" w16cid:durableId="473375184">
+    <w:abstractNumId w:val="21"/>
+  </w:num>
+  <w:num w:numId="10" w16cid:durableId="1610699387">
+    <w:abstractNumId w:val="19"/>
+  </w:num>
+  <w:num w:numId="11" w16cid:durableId="1949578253">
+    <w:abstractNumId w:val="6"/>
+  </w:num>
+  <w:num w:numId="12" w16cid:durableId="829175418">
+    <w:abstractNumId w:val="1"/>
+  </w:num>
+  <w:num w:numId="13" w16cid:durableId="200173888">
+    <w:abstractNumId w:val="3"/>
+  </w:num>
+  <w:num w:numId="14" w16cid:durableId="635915411">
+    <w:abstractNumId w:val="22"/>
+  </w:num>
+  <w:num w:numId="15" w16cid:durableId="697119817">
+    <w:abstractNumId w:val="4"/>
+  </w:num>
+  <w:num w:numId="16" w16cid:durableId="1633092264">
+    <w:abstractNumId w:val="13"/>
+  </w:num>
+  <w:num w:numId="17" w16cid:durableId="572930163">
+    <w:abstractNumId w:val="18"/>
+  </w:num>
+  <w:num w:numId="18" w16cid:durableId="115762571">
+    <w:abstractNumId w:val="16"/>
+  </w:num>
+  <w:num w:numId="19" w16cid:durableId="872883829">
+    <w:abstractNumId w:val="17"/>
+  </w:num>
+  <w:num w:numId="20" w16cid:durableId="1232499413">
     <w:abstractNumId w:val="8"/>
   </w:num>
-  <w:num w:numId="2" w16cid:durableId="222301535">
-    <w:abstractNumId w:val="13"/>
+  <w:num w:numId="21" w16cid:durableId="1551651441">
+    <w:abstractNumId w:val="5"/>
   </w:num>
-  <w:num w:numId="3" w16cid:durableId="1746368024">
-    <w:abstractNumId w:val="9"/>
-  </w:num>
-  <w:num w:numId="4" w16cid:durableId="53234700">
-    <w:abstractNumId w:val="11"/>
-  </w:num>
-  <w:num w:numId="5" w16cid:durableId="1110395120">
-    <w:abstractNumId w:val="1"/>
-  </w:num>
-  <w:num w:numId="6" w16cid:durableId="2086339162">
-    <w:abstractNumId w:val="14"/>
-  </w:num>
-  <w:num w:numId="7" w16cid:durableId="1847086496">
-    <w:abstractNumId w:val="6"/>
-  </w:num>
-  <w:num w:numId="8" w16cid:durableId="20325769">
-    <w:abstractNumId w:val="10"/>
-  </w:num>
-  <w:num w:numId="9" w16cid:durableId="473375184">
+  <w:num w:numId="22" w16cid:durableId="495460898">
     <w:abstractNumId w:val="20"/>
   </w:num>
-  <w:num w:numId="10" w16cid:durableId="1610699387">
-    <w:abstractNumId w:val="18"/>
-  </w:num>
-  <w:num w:numId="11" w16cid:durableId="1949578253">
-    <w:abstractNumId w:val="5"/>
-  </w:num>
-  <w:num w:numId="12" w16cid:durableId="829175418">
+  <w:num w:numId="23" w16cid:durableId="1627276939">
     <w:abstractNumId w:val="0"/>
-  </w:num>
-  <w:num w:numId="13" w16cid:durableId="200173888">
-    <w:abstractNumId w:val="2"/>
-  </w:num>
-  <w:num w:numId="14" w16cid:durableId="635915411">
-    <w:abstractNumId w:val="21"/>
-  </w:num>
-  <w:num w:numId="15" w16cid:durableId="697119817">
-    <w:abstractNumId w:val="3"/>
-  </w:num>
-  <w:num w:numId="16" w16cid:durableId="1633092264">
-    <w:abstractNumId w:val="12"/>
-  </w:num>
-  <w:num w:numId="17" w16cid:durableId="572930163">
-    <w:abstractNumId w:val="17"/>
-  </w:num>
-  <w:num w:numId="18" w16cid:durableId="115762571">
-    <w:abstractNumId w:val="15"/>
-  </w:num>
-  <w:num w:numId="19" w16cid:durableId="872883829">
-    <w:abstractNumId w:val="16"/>
-  </w:num>
-  <w:num w:numId="20" w16cid:durableId="1232499413">
-    <w:abstractNumId w:val="7"/>
-  </w:num>
-  <w:num w:numId="21" w16cid:durableId="1551651441">
-    <w:abstractNumId w:val="4"/>
-  </w:num>
-  <w:num w:numId="22" w16cid:durableId="495460898">
-    <w:abstractNumId w:val="19"/>
   </w:num>
 </w:numbering>
 </file>

</xml_diff>